<commit_message>
Add work/interval clock for all timed prescriptions
New WorkClock beside the rest timer, preset from the prescription:
intervals (8x30/90, "6x1min on/1min easy", rounds from the sets column),
holds (planks, wall sits) that flow into the rest period, wall-sit ladders
with rest between steps, and steady cardio blocks with a halfway alert.
Beep + vibration + announcement on every transition; round counter;
timestamp-based so background throttling can't drift it. Rep/distance
work shows no clock (rest timer covers it).

Co-Authored-By: Claude Opus 4.8 <noreply@anthropic.com>
</commit_message>
<xml_diff>
--- a/IDEAS.docx
+++ b/IDEAS.docx
@@ -28,6 +28,94 @@
       <w:proofErr w:type="spellEnd"/>
       <w:r>
         <w:t>)</w:t>
+      </w:r>
+    </w:p>
+    <w:p>
+      <w:r>
+        <w:t>Landmine:</w:t>
+      </w:r>
+    </w:p>
+    <w:p>
+      <w:r>
+        <w:t xml:space="preserve">Split quats, Alternating lunges, </w:t>
+      </w:r>
+      <w:proofErr w:type="gramStart"/>
+      <w:r>
+        <w:t>Bent</w:t>
+      </w:r>
+      <w:proofErr w:type="gramEnd"/>
+      <w:r>
+        <w:t xml:space="preserve"> over row, front squat, tall kneel arc rotations, half kneel arc rotations, split stance push Single arm (SA) push press, Single leg RDL</w:t>
+      </w:r>
+    </w:p>
+    <w:p>
+      <w:r>
+        <w:t>Corrections:</w:t>
+      </w:r>
+    </w:p>
+    <w:p>
+      <w:r>
+        <w:t>Supine:</w:t>
+      </w:r>
+      <w:r>
+        <w:t xml:space="preserve"> Pelvic tilt, dead bug, iron cross, bridge</w:t>
+      </w:r>
+    </w:p>
+    <w:p>
+      <w:proofErr w:type="spellStart"/>
+      <w:r>
+        <w:t>Sidelying</w:t>
+      </w:r>
+      <w:proofErr w:type="spellEnd"/>
+      <w:r>
+        <w:t>:</w:t>
+      </w:r>
+      <w:r>
+        <w:t xml:space="preserve"> </w:t>
+      </w:r>
+      <w:proofErr w:type="gramStart"/>
+      <w:r>
+        <w:t>3 way</w:t>
+      </w:r>
+      <w:proofErr w:type="gramEnd"/>
+      <w:r>
+        <w:t xml:space="preserve"> clamshell, abduction, single arm row, open book</w:t>
+      </w:r>
+    </w:p>
+    <w:p>
+      <w:proofErr w:type="spellStart"/>
+      <w:r>
+        <w:t>Quadriped</w:t>
+      </w:r>
+      <w:proofErr w:type="spellEnd"/>
+      <w:r>
+        <w:t>:</w:t>
+      </w:r>
+      <w:r>
+        <w:t xml:space="preserve"> Bird dog, fire hydrant</w:t>
+      </w:r>
+    </w:p>
+    <w:p>
+      <w:r>
+        <w:t>Tall kneel:</w:t>
+      </w:r>
+    </w:p>
+    <w:p>
+      <w:r>
+        <w:t xml:space="preserve">Half Kneel: </w:t>
+      </w:r>
+    </w:p>
+    <w:p>
+      <w:r>
+        <w:t xml:space="preserve">Standing: </w:t>
+      </w:r>
+      <w:proofErr w:type="spellStart"/>
+      <w:r>
+        <w:t>Paloff</w:t>
+      </w:r>
+      <w:proofErr w:type="spellEnd"/>
+      <w:r>
+        <w:t xml:space="preserve"> press (core rotation stabilization), </w:t>
       </w:r>
     </w:p>
     <w:p/>

</xml_diff>